<commit_message>
PD at Origination spec: Dr Thom ratifies decisions 1 to 5 only, the build; adoption of setting 9 and decision 6 stay his for later
Co-Authored-By: Claude Opus 5.5 <noreply@anthropic.com>
</commit_message>
<xml_diff>
--- a/docs/MAIIC_PD_at_Origination_Specification_v1_2026-10-16.docx
+++ b/docs/MAIIC_PD_at_Origination_Specification_v1_2026-10-16.docx
@@ -1532,6 +1532,53 @@
           <w:b/>
           <w:i w:val="0"/>
         </w:rPr>
+        <w:t>What Dr Thom ratifies.</w:t>
+      </w:r>
+      <w:r>
+        <w:rPr>
+          <w:b w:val="0"/>
+          <w:i w:val="0"/>
+        </w:rPr>
+        <w:t xml:space="preserve"> Only decisions 1 to 5, which are exactly what this build does: keep the starting reading, compare the 12-month PD, treat the older loans as decided, set the two thresholds, and run the test in shadow. None of them changes a stage, an ECL, revenue or the RBM return. Two things are not part of the ratification and stay his to decide later: </w:t>
+      </w:r>
+      <w:r>
+        <w:rPr>
+          <w:b/>
+          <w:i w:val="0"/>
+        </w:rPr>
+        <w:t>adopting the test</w:t>
+      </w:r>
+      <w:r>
+        <w:rPr>
+          <w:b w:val="0"/>
+          <w:i w:val="0"/>
+        </w:rPr>
+        <w:t xml:space="preserve"> (switching setting 9 on, so that loans actually move to Stage 2), which is a governed change of its own, proposed and approved by two people with the shadow reports as evidence; and </w:t>
+      </w:r>
+      <w:r>
+        <w:rPr>
+          <w:b/>
+          <w:i w:val="0"/>
+        </w:rPr>
+        <w:t>decision 6</w:t>
+      </w:r>
+      <w:r>
+        <w:rPr>
+          <w:b w:val="0"/>
+          <w:i w:val="0"/>
+        </w:rPr>
+        <w:t>, which is a recommendation to MAIIC Credit and is not built here.</w:t>
+      </w:r>
+    </w:p>
+    <w:p>
+      <w:pPr>
+        <w:spacing w:after="120"/>
+      </w:pPr>
+      <w:r>
+        <w:rPr>
+          <w:b/>
+          <w:i w:val="0"/>
+        </w:rPr>
         <w:t>At adoption,</w:t>
       </w:r>
       <w:r>

</xml_diff>